<commit_message>
chore(astrologie-karmique-lecon): livrables auto 2026-10-01
</commit_message>
<xml_diff>
--- a/livrables/lecons/stoicisme/2026-10-01_lecon-stoicisme_17_stoicisme-christianisme-emprunts-divergences-posterite.docx
+++ b/livrables/lecons/stoicisme/2026-10-01_lecon-stoicisme_17_stoicisme-christianisme-emprunts-divergences-posterite.docx
@@ -168,7 +168,18 @@
           <w:sz w:val="22"/>
           <w:szCs w:val="22"/>
         </w:rPr>
-        <w:t xml:space="preserve">Le stoïcisme impérial et le christianisme primitif sont contemporains : Sénèque meurt en 65 apr. J.-C., Paul de Tarse circule dans le monde romain au même moment. Les deux traditions naissent dans le même bain culturel hellénistique, s'adressent aux mêmes classes urbaines, et proposent toutes deux une philosophie de vie face à la souffrance, à la mort et à l'injustice. Une correspondance apocryphe entre Paul et Sénèque circule dès l'Antiquité — mentionnée par Jérôme et Augustin — ; son inauthenticité n'empêche pas qu'elle témoigne de la conviction, partagée très tôt, que les deux hommes avaient beaucoup à se dire (d'après Durand, Shogry et Baltzly, Stanford Encyclopedia of Philosophy, « Stoicism », 2023).</w:t>
+        <w:t xml:space="preserve">Le stoïcisme impérial et le christianisme primitif sont contemporains : Sénèque meurt en 65 apr. J.-C., Paul de Tarse circule dans le monde romain au même moment. Les deux traditions naissent dans le même bain culturel hellénistique, s'adressent aux mêmes classes urbaines, et proposent toutes deux une philosophie de vie face à la souffrance, à la mort et à l'injustice. Une correspondance apocryphe entre Paul et Sénèque circule dès l'Antiquité — mentionnée par Jérôme et Augustin — ; son inauthenticité n'empêche pas qu'elle témoigne de la conviction, partagée très tôt, que les deux hommes avaient beaucoup à se dire (d'après Durand, Shogry et Baltzly, Stanford Encyclopedia of Philosophy, « Stoicism », 2023). La recherche va plus loin que cette conviction : dans le volume recensé par Samuli Siikavirta, Thorsteinsson lit l'éthique paulinienne de Romains 12-15 en faisant du stoïcisme sa clé d'interprétation, et Stanley K. Stowers lit le Jésus de Matthieu comme une refonte du Jésus de Marc sur le modèle du sage-enseignant stoïcien.</w:t>
+      </w:r>
+      <w:r>
+        <w:rPr>
+          <w:rFonts w:ascii="Times New Roman" w:cs="Times New Roman" w:eastAsia="Times New Roman" w:hAnsi="Times New Roman"/>
+          <w:i/>
+          <w:iCs/>
+          <w:color w:val="6B7280"/>
+          <w:sz w:val="20"/>
+          <w:szCs w:val="20"/>
+        </w:rPr>
+        <w:t xml:space="preserve"> [Ajouté le 01/10/2026 : la première correction avait retiré du corps la seule mention de Siikavirta en rendant l'Enchiridion à Pigliucci ; sa recension redevient une source employée, pour ce qu'elle porte réellement.]</w:t>
       </w:r>
     </w:p>
     <w:p>
@@ -2416,6 +2427,20 @@
           <w:sz w:val="22"/>
           <w:szCs w:val="22"/>
         </w:rPr>
+        <w:t xml:space="preserve">Ressources (suite 2) — en rendant l'Enchiridion à Pigliucci, la correction avait fait de Siikavirta une ressource listée sans emploi. Le § 1 le cite désormais pour ce que sa page soutient : Romains 12-15 chez Thorsteinsson, et le sage-enseignant stoïcien chez Stowers.</w:t>
+      </w:r>
+    </w:p>
+    <w:p>
+      <w:pPr>
+        <w:spacing w:after="40" w:before="40"/>
+      </w:pPr>
+      <w:r>
+        <w:rPr>
+          <w:rFonts w:ascii="Times New Roman" w:cs="Times New Roman" w:eastAsia="Times New Roman" w:hAnsi="Times New Roman"/>
+          <w:color w:val="1F2937"/>
+          <w:sz w:val="22"/>
+          <w:szCs w:val="22"/>
+        </w:rPr>
         <w:t xml:space="preserve">Coquilles — « semble découlter » pour découler ; « quand je comets » pour commets.</w:t>
       </w:r>
     </w:p>

</xml_diff>